<commit_message>
Land the AZ discovery rewrite, refresh multilingual hubs and compare pages, and update shared site chrome.
Co-authored-by: Cursor <cursoragent@cursor.com>
</commit_message>
<xml_diff>
--- a/az/discovery-articles/1.1 Oddan məqsədli istifadə.docx
+++ b/az/discovery-articles/1.1 Oddan məqsədli istifadə.docx
@@ -8,7 +8,7 @@
         <w:widowControl/>
       </w:pPr>
       <w:r>
-        <w:t>1.1 Oddan məqsədli istifadə</w:t>
+        <w:t>1.1 Odun ram edilməsi</w:t>
       </w:r>
     </w:p>
     <w:p>
@@ -20,7 +20,7 @@
         <w:rPr>
           <w:sz w:val="20"/>
         </w:rPr>
-        <w:t>1 Sivilizasiyanın təməlləri</w:t>
+        <w:t xml:space="preserve">1. Sivilizasiyanın təməlləri</w:t>
       </w:r>
     </w:p>
     <w:p>
@@ -32,7 +32,7 @@
         <w:rPr>
           <w:sz w:val="20"/>
         </w:rPr>
-        <w:t>Dövr: təxminən e.ə. 1 000 000–400 000-ci illər | Əsas iştirakçılar: Homo erectus (ən erkən dəlillər); sonralar Homo sapiens</w:t>
+        <w:t xml:space="preserve">Dövr: Təxminən bir milyon il əvvəlki erkən izlərdən 400 min il əvvəl daha aydın görünən müntəzəm istifadəyə qədər. | Oddan ilk istifadə edənlər: Homo erectus kimi qədim insan növləri; sonrakı dövrlərdə Homo sapiens — müasir insan</w:t>
       </w:r>
     </w:p>
     <w:p>
@@ -40,7 +40,7 @@
         <w:widowControl/>
       </w:pPr>
       <w:r>
-        <w:t>Odu qoruyub saxlamağı, daha sonra isə yandırmağı öyrənən qədim insanlar isinmək, yemək bişirmək, qaranlıqda işıq əldə etmək və materiallara forma vermək imkanı qazandılar. Bu, izlərini arxeoloji tapıntılarda hələ də görə bildiyimiz ən qədim texnologiyalardan biridir.</w:t>
+        <w:t xml:space="preserve">Qədim insanlar əvvəlcə odu sönməyə qoymamağı, sonralar isə özləri od qalamağı öyrəndilər. Od onlara isinmək, yemək bişirmək, qaranlığı işıqlandırmaq və müxtəlif materialları emal etmək imkanı verdi. Oddan istifadə izləri arxeoloji tapıntılarda qorunub qalmış ən qədim insan bacarıqlarından biridir.</w:t>
       </w:r>
     </w:p>
     <w:p>
@@ -49,7 +49,7 @@
         <w:widowControl/>
       </w:pPr>
       <w:r>
-        <w:t>Əsas məlumatlar</w:t>
+        <w:t xml:space="preserve">Əsas məlumatlar</w:t>
       </w:r>
     </w:p>
     <w:p>
@@ -58,7 +58,7 @@
         <w:widowControl/>
       </w:pPr>
       <w:r>
-        <w:t>Oddan istifadəyə dair geniş qəbul olunan ən qədim dəlillər Cənubi Afrikadakı Vonderverk mağarasında tapılıb və təxminən bir milyon il əvvələ aiddir.</w:t>
+        <w:t xml:space="preserve">Cənubi Afrikadakı Vonderverk mağarasında tapılmış, təxminən bir milyon il əvvələ aid qalıqlar oddan istifadənin elmi dairələrdə geniş qəbul olunan ən qədim dəlillərindəndir.</w:t>
       </w:r>
     </w:p>
     <w:p>
@@ -67,7 +67,7 @@
         <w:widowControl/>
       </w:pPr>
       <w:r>
-        <w:t>Oddan müntəzəm və məqsədli istifadənin dəlilləri təxminən 400 min il əvvəldən daha aydın görünür.</w:t>
+        <w:t xml:space="preserve">İnsanların odu nəzarətdə saxlayaraq gündəlik həyatlarında istifadə etdiklərinə dair izlər təxminən 400 min il əvvəldən daha aydın görünür.</w:t>
       </w:r>
     </w:p>
     <w:p>
@@ -76,7 +76,7 @@
         <w:widowControl/>
       </w:pPr>
       <w:r>
-        <w:t>Bişirmək qidanı daha təhlükəsiz və həzmə daha asan edirdi.</w:t>
+        <w:t xml:space="preserve">Yeməyi bişirmək qidanı çox vaxt daha təhlükəsiz edir, həzmini asanlaşdırırdı.</w:t>
       </w:r>
     </w:p>
     <w:p>
@@ -85,7 +85,7 @@
         <w:widowControl/>
       </w:pPr>
       <w:r>
-        <w:t>Ocaqlar insanların bir araya gəlməsinə və soyuq bölgələrdə məskunlaşmasına şərait yaradırdı.</w:t>
+        <w:t xml:space="preserve">Ocaq insanları bir araya gətirir, soyuq iqlimli yerlərdə yaşamağa kömək edirdi.</w:t>
       </w:r>
     </w:p>
     <w:p>
@@ -94,7 +94,7 @@
         <w:widowControl/>
       </w:pPr>
       <w:r>
-        <w:t>Sonralar istidən istifadə dulusçuluğun, metallurgiyanın, şüşə istehsalının və sənayenin inkişafına yol açdı.</w:t>
+        <w:t xml:space="preserve">Oddan istifadə sonralar saxsı qab və şüşə hazırlanmasına, metalların emalına və sənayenin inkişafına zəmin yaratdı.</w:t>
       </w:r>
     </w:p>
     <w:p>
@@ -103,7 +103,7 @@
         <w:widowControl/>
       </w:pPr>
       <w:r>
-        <w:t>Bu nədir</w:t>
+        <w:t xml:space="preserve">Odu idarə etmək nə deməkdir?</w:t>
       </w:r>
     </w:p>
     <w:p>
@@ -111,7 +111,23 @@
         <w:widowControl/>
       </w:pPr>
       <w:r>
-        <w:t>Oddan məqsədli istifadə təbiətdə baş verən yanğını seyr etməkdən ibarət deyil. Bu, alovu sönməyə qoymamaq, onu lazım olan yerə aparmaq və sonrakı mərhələdə özün yandırmaq deməkdir. Ocaq odun və ya başqa yanacaq əlavə edilərək istisindən istifadə olunan qorunan yerdir. Bu isti yemək bişirir, heyvanları uzaqlaşdırır, dəriləri qurudur, gili bərkidir və gecəni işıqlandırırdı. Od insanın yalnız mühitə uyğunlaşmasına deyil, mühiti dəyişməsinə də xidmət edən ilk vasitələrdən biri idi.</w:t>
+        <w:t xml:space="preserve">Odu idarə etmək təbiətdəki yanğını müşahidə etməklə bitmirdi. İnsan alovu qorumağı, başqa yerə daşımağı və ehtiyac duyduğu vaxt özü od qalamağı öyrənməli idi.</w:t>
+      </w:r>
+    </w:p>
+    <w:p>
+      <w:pPr>
+        <w:widowControl/>
+      </w:pPr>
+      <w:r>
+        <w:t xml:space="preserve">Odun və ya başqa yanacağın yandırıldığı, alovun nəzarətdə saxlanıldığı yerə ocaq deyilir. Ocaq insanı isidir, yeməyini bişirir, vəhşi heyvanları uzaqlaşdırmağa kömək edir və gecənin qaranlığını işıqlandırırdı. Onun istisindən dəriləri qurutmaq, gili bişirib bərkitmək üçün də istifadə olunurdu.</w:t>
+      </w:r>
+    </w:p>
+    <w:p>
+      <w:pPr>
+        <w:widowControl/>
+      </w:pPr>
+      <w:r>
+        <w:t xml:space="preserve">Beləcə, insan yalnız yaşadığı mühitə uyğunlaşmır, odun köməyi ilə həmin mühiti öz ehtiyaclarına uyğun dəyişə bilirdi.</w:t>
       </w:r>
     </w:p>
     <w:p>
@@ -120,7 +136,7 @@
         <w:widowControl/>
       </w:pPr>
       <w:r>
-        <w:t>Kim kəşf edib və ya yaradıb</w:t>
+        <w:t xml:space="preserve">Oddan ilk kimlər istifadə edib?</w:t>
       </w:r>
     </w:p>
     <w:p>
@@ -128,7 +144,23 @@
         <w:widowControl/>
       </w:pPr>
       <w:r>
-        <w:t>Burada tək bir ixtiraçının adını çəkmək mümkün deyil. Oddan ilk istifadə edənlər Homo sapiensdən çox əvvəl yaşamış insan əcdadları, xüsusilə Homo erectus idi. Arxeoloqlar bunu mağaralarda və açıq yaşayış yerlərində tapılan yanmış sümüklər, kül və istiyə məruz qalmış daşlar əsasında müəyyənləşdirirlər. Sonrakı insan qrupları daşları bir-birinə vuraraq qığılcım çıxarmağı və ya sürtünmə ilə istilik yaratmağı öyrəndilər. Bu bacarıq patent və ya məşhur bir ad sayəsində deyil, öyrətmə və təqlid yolu ilə yayıldı.</w:t>
+        <w:t xml:space="preserve">Oddan istifadəni konkret bir insanın adı ilə bağlamaq mümkün deyil. Ən erkən istifadə müasir insandan xeyli əvvəl yaşamış qədim insan növləri, xüsusən Homo erectus ilə əlaqələndirilir. Homo sapiens, yəni müasir insan isə bu bacarığı sonrakı dövrlərdə davam etdirib inkişaf etdirdi.</w:t>
+      </w:r>
+    </w:p>
+    <w:p>
+      <w:pPr>
+        <w:widowControl/>
+      </w:pPr>
+      <w:r>
+        <w:t xml:space="preserve">Arxeoloqlar qədim insanların oddan necə istifadə etdiyini mağaralarda və açıq yaşayış yerlərində tapılan yanmış sümüklər, kül qalıqları və istinin təsirindən dəyişmiş daşlar əsasında araşdırırlar.</w:t>
+      </w:r>
+    </w:p>
+    <w:p>
+      <w:pPr>
+        <w:widowControl/>
+      </w:pPr>
+      <w:r>
+        <w:t xml:space="preserve">Zaman keçdikcə insanlar uyğun daşları bir-birinə vuraraq qığılcım çıxarmağı, sürtünmə ilə od əldə etməyi də öyrəndilər. Bu bacarıqlar bir nəfərin ixtirası kimi yayılmadı. İnsanlar bir-birinə baxaraq öyrənir, bildiklərini başqalarına ötürürdülər. Beləliklə, təcrübə nəsildən-nəslə keçirdi.</w:t>
       </w:r>
     </w:p>
     <w:p>
@@ -137,7 +169,7 @@
         <w:widowControl/>
       </w:pPr>
       <w:r>
-        <w:t>Nə vaxt və necə yaranıb</w:t>
+        <w:t xml:space="preserve">Nə vaxt və necə mənimsənilib?</w:t>
       </w:r>
     </w:p>
     <w:p>
@@ -145,7 +177,15 @@
         <w:widowControl/>
       </w:pPr>
       <w:r>
-        <w:t>Cənubi Afrikadakı Vonderverk mağarasından tapılmış kül və yanmış qalıqlar təxminən bir milyon il əvvələ aiddir. İsraildəki Kesem mağarası da mühüm tapıntı yerlərindəndir. Oddan gündəlik və müntəzəm istifadənin izləri təxminən 400 min il əvvəldən daha aydın görünür. İnsanlar ilk vaxtlarda, demək olar ki, şübhəsiz, ildırım və ya vulkan fəaliyyəti nəticəsində yaranan oddan köz götürüb onu qoruyurdular. Odu özləri yandırmağı daha sonra öyrəndilər; bu da əvvəlki qədər mühüm ikinci addım idi.</w:t>
+        <w:t xml:space="preserve">Vonderverk mağarasında tapılan kül və yanmış qalıqlar təxminən bir milyon il əvvələ aiddir. İsraildəki Kesem mağarası da oddan istifadənin tarixini öyrənmək üçün mühüm yerlərdən biridir. Təxminən 400 min il əvvəldən başlayaraq insanların odu nəzarətdə saxlamasına və müntəzəm istifadə etməsinə dair dəlillər daha aydın görünür.</w:t>
+      </w:r>
+    </w:p>
+    <w:p>
+      <w:pPr>
+        <w:widowControl/>
+      </w:pPr>
+      <w:r>
+        <w:t xml:space="preserve">Ehtimal olunur ki, insanlar ilk vaxtlar ildırım və ya vulkan püskürməsi nəticəsində yaranan yanğınlardan köz götürür, onu sönməyə qoymadan qoruyurdular. Özləri od qalamağı isə sonralar öyrəndilər. Bu, mühüm dönüş idi: artıq təkcə hazır odu qorumaq deyil, lazım olduqda od əldə etmək də mümkün olmuşdu.</w:t>
       </w:r>
     </w:p>
     <w:p>
@@ -154,7 +194,7 @@
         <w:widowControl/>
       </w:pPr>
       <w:r>
-        <w:t>Elm üçün əhəmiyyəti</w:t>
+        <w:t xml:space="preserve">Elm baxımından nə üçün əhəmiyyətlidir?</w:t>
       </w:r>
     </w:p>
     <w:p>
@@ -162,7 +202,31 @@
         <w:widowControl/>
       </w:pPr>
       <w:r>
-        <w:t>Bişmiş qida daha yumşaq və çox vaxt daha təhlükəsiz olur. Ondan orqanizmin istifadə edə bildiyi enerji də arta bilər. Riçard Renqem də daxil olmaqla bir çox tədqiqatçı bunu insan beyninin böyüməsi və bağırsağın qısalması ilə əlaqələndirir. Od insanların fəal olduğu vaxtı da uzatdı: işıq və isti sayəsində gün batandan sonra işləmək, söhbətləşmək və alət düzəltmək mümkün oldu. Elmi baxımdan bu, insanın müəyyən nəticə əldə etmək üçün kimyəvi reaksiyanı — yanmanı — etibarlı şəkildə idarə etməsinin ilk nümunəsi idi.</w:t>
+        <w:t xml:space="preserve">Bişirmə qidanı yumşaldır, həzmini asanlaşdırır və çox vaxt onu daha təhlükəsiz edir. Orqanizm bişmiş qidadan daha çox enerji ala bilər.</w:t>
+      </w:r>
+    </w:p>
+    <w:p>
+      <w:pPr>
+        <w:widowControl/>
+      </w:pPr>
+      <w:r>
+        <w:t xml:space="preserve">Riçard Renqem də daxil olmaqla bir sıra tədqiqatçılar qidanın bişirilməsinin insan beyninin böyüməsində və bağırsaqlarının qısalmasında rol oynadığını irəli sürürlər. Bu əlaqə insanın təkamülünü izah etməyə çalışan elmi yanaşmalardan biridir.</w:t>
+      </w:r>
+    </w:p>
+    <w:p>
+      <w:pPr>
+        <w:widowControl/>
+      </w:pPr>
+      <w:r>
+        <w:t xml:space="preserve">Od gündəlik fəaliyyət üçün ayrılan vaxtı da artırdı. Gün batandan sonra ocağın işığında işləmək, alət düzəltmək və söhbət etmək mümkün oldu.</w:t>
+      </w:r>
+    </w:p>
+    <w:p>
+      <w:pPr>
+        <w:widowControl/>
+      </w:pPr>
+      <w:r>
+        <w:t xml:space="preserve">Kimyəvi baxımdan yanma bir reaksiyadır. İnsan odu qoruyub onun gücünü tənzimləməyi öyrənməklə təbiətdə baş verən bu prosesi məqsədli şəkildə idarə etməyə başladı.</w:t>
       </w:r>
     </w:p>
     <w:p>
@@ -171,7 +235,7 @@
         <w:widowControl/>
       </w:pPr>
       <w:r>
-        <w:t>Sonrakı inkişafa təsiri</w:t>
+        <w:t xml:space="preserve">Sonrakı ixtiralara necə yol açıb?</w:t>
       </w:r>
     </w:p>
     <w:p>
@@ -179,7 +243,23 @@
         <w:widowControl/>
       </w:pPr>
       <w:r>
-        <w:t>İstidən məqsədli istifadə dulusçuluq, kərpic, şüşə və ağac kömürü istehsalı, mis, tunc və dəmirin əridilməsi kimi işlərə yol açdı. Bu materiallardan alətlər, silahlar və binalar, xeyli sonra isə buxar maşınları və elektrik stansiyaları yarandı. Müasir sənaye də idarə olunan istilikdən asılıdır. Bu mənada qədim ocaq sonrakı sobaların və fabriklərin uzaq başlanğıcıdır.</w:t>
+        <w:t xml:space="preserve">Oddan və istilikdən məqsədyönlü istifadə saxsı qab, kərpic, şüşə və odun kömürü hazırlamağa, mis, tunc və dəmir kimi metalları emal etməyə yol açdı. İnsanlar bu materiallardan alət və silahlar düzəltdilər, binalar tikdilər.</w:t>
+      </w:r>
+    </w:p>
+    <w:p>
+      <w:pPr>
+        <w:widowControl/>
+      </w:pPr>
+      <w:r>
+        <w:t xml:space="preserve">İstilikdən istifadə haqqında biliklər zamanla genişləndi. Çox sonralar buxar maşınlarının və istilik elektrik stansiyalarının yaranması da bu inkişafın davamı oldu.</w:t>
+      </w:r>
+    </w:p>
+    <w:p>
+      <w:pPr>
+        <w:widowControl/>
+      </w:pPr>
+      <w:r>
+        <w:t xml:space="preserve">Müasir sənayedə istiliyin alınması və idarə olunması mühüm yer tutur. Bu baxımdan qədim insanın qaladığı ocaqdan bugünkü sənaye sobalarına və zavodlara qədər uzanan bir inkişaf yolu var.</w:t>
       </w:r>
     </w:p>
     <w:p>
@@ -188,7 +268,7 @@
         <w:widowControl/>
       </w:pPr>
       <w:r>
-        <w:t>İnsan həyatını necə dəyişib</w:t>
+        <w:t xml:space="preserve">İnsanların həyatını necə dəyişib?</w:t>
       </w:r>
     </w:p>
     <w:p>
@@ -196,7 +276,23 @@
         <w:widowControl/>
       </w:pPr>
       <w:r>
-        <w:t>Od insanların daha soyuq iqlimlərdə yaşamasına, bir ocaq başına yığışmasına və qaranlıq düşəndən sonra hekayələr danışmasına imkan verdi. Qidalanmanı, sağlamlığı və gündəlik həyatın gedişini dəyişdi. Bununla yanaşı, yanıq və meşə yanğınları, sonrakı dövrlərdə isə silahlar və çirklənmə kimi təhlükələr gətirdi. Oddan məqsədli istifadə olmasaydı, bildiyimiz şəkildə yemək bişirmək, metallardan yararlanmaq və sənaye dünyasını qurmaq mümkün olmazdı. Bu, insanın enerjidən geniş miqyasda yararlanmasının ilk böyük addımı idi.</w:t>
+        <w:t xml:space="preserve">Od insanların soyuq yerlərdə yaşamasına, ocaq başına toplaşmasına, qaranlıq düşəndən sonra da söhbət edib nağıl danışmasına şərait yaratdı. Qidalanmanı, sağlamlığı və gündəlik yaşayışı dəyişdirdi.</w:t>
+      </w:r>
+    </w:p>
+    <w:p>
+      <w:pPr>
+        <w:widowControl/>
+      </w:pPr>
+      <w:r>
+        <w:t xml:space="preserve">Lakin oddan istifadə təhlükəsiz deyildi. Yanıqlar və nəzarətdən çıxan alovun meşəyə yayılması insanlara zərər verə bilərdi. Sonrakı dövrlərdə oddan silah hazırlanmasında da istifadə olundu. Yanacaq yandırılması isə ətraf mühitin çirklənməsinə səbəb oldu.</w:t>
+      </w:r>
+    </w:p>
+    <w:p>
+      <w:pPr>
+        <w:widowControl/>
+      </w:pPr>
+      <w:r>
+        <w:t xml:space="preserve">Oddan istifadə etməyi öyrənmək yemək bişirmədən metal emalına və sənayeyə qədər çox geniş bir inkişafın əsasını qoydu. İnsan enerjini öz ehtiyaclarına yönəltmək yolunda ilk böyük addımlarından birini ocaq qalamaqla atdı.</w:t>
       </w:r>
     </w:p>
     <w:p>
@@ -217,7 +313,7 @@
         <w:rPr>
           <w:sz w:val="20"/>
         </w:rPr>
-        <w:t>A Kitablar və əsas elmi əsərlər</w:t>
+        <w:t>Kitablar və əsas elmi əsərlər</w:t>
       </w:r>
     </w:p>
     <w:p>
@@ -240,7 +336,7 @@
         <w:rPr>
           <w:sz w:val="20"/>
         </w:rPr>
-        <w:t>C Qurumların materialları və ensiklopedik mənbələr</w:t>
+        <w:t>Qurumların materialları və ensiklopedik mənbələr</w:t>
       </w:r>
     </w:p>
     <w:p>
@@ -300,7 +396,7 @@
         <w:rPr>
           <w:sz w:val="20"/>
         </w:rPr>
-        <w:t>D Muzey arxiv və kitabxana materialları</w:t>
+        <w:t>Muzey arxiv və kitabxana materialları</w:t>
       </w:r>
     </w:p>
     <w:p>

</xml_diff>